<commit_message>
Started setting up tables (airport and airport staff)
</commit_message>
<xml_diff>
--- a/.documentation/3 - Design.docx
+++ b/.documentation/3 - Design.docx
@@ -9865,10 +9865,7 @@
               <w:t>is sent to backend API on form submission</w:t>
             </w:r>
             <w:r>
-              <w:t xml:space="preserve"> </w:t>
-            </w:r>
-            <w:r>
-              <w:t>to be added to database.</w:t>
+              <w:t xml:space="preserve"> to be added to database.</w:t>
             </w:r>
           </w:p>
         </w:tc>
@@ -9890,13 +9887,7 @@
           </w:tcPr>
           <w:p>
             <w:r>
-              <w:t xml:space="preserve">Row 1, column </w:t>
-            </w:r>
-            <w:r>
-              <w:t>2</w:t>
-            </w:r>
-            <w:r>
-              <w:t xml:space="preserve"> of any add user modal</w:t>
+              <w:t>Row 1, column 2 of any add user modal</w:t>
             </w:r>
           </w:p>
         </w:tc>
@@ -9906,16 +9897,10 @@
           </w:tcPr>
           <w:p>
             <w:r>
-              <w:t>Last</w:t>
-            </w:r>
-            <w:r>
-              <w:t xml:space="preserve"> name text entry is sent to backend API on form submission</w:t>
-            </w:r>
-            <w:r>
-              <w:t xml:space="preserve"> </w:t>
-            </w:r>
-            <w:r>
-              <w:t>to be added to database.</w:t>
+              <w:t>Last name text entry is sent to backend API on form submission</w:t>
+            </w:r>
+            <w:r>
+              <w:t xml:space="preserve"> to be added to database.</w:t>
             </w:r>
           </w:p>
         </w:tc>
@@ -9937,13 +9922,7 @@
           </w:tcPr>
           <w:p>
             <w:r>
-              <w:t xml:space="preserve">Row </w:t>
-            </w:r>
-            <w:r>
-              <w:t>2</w:t>
-            </w:r>
-            <w:r>
-              <w:t>, column 1 of any add user modal</w:t>
+              <w:t>Row 2, column 1 of any add user modal</w:t>
             </w:r>
           </w:p>
         </w:tc>
@@ -9953,16 +9932,10 @@
           </w:tcPr>
           <w:p>
             <w:r>
-              <w:t>Email</w:t>
-            </w:r>
-            <w:r>
-              <w:t xml:space="preserve"> entry is sent to backend API on form submission</w:t>
-            </w:r>
-            <w:r>
-              <w:t xml:space="preserve"> </w:t>
-            </w:r>
-            <w:r>
-              <w:t>to be added to database.</w:t>
+              <w:t>Email entry is sent to backend API on form submission</w:t>
+            </w:r>
+            <w:r>
+              <w:t xml:space="preserve"> to be added to database.</w:t>
             </w:r>
           </w:p>
         </w:tc>
@@ -9984,13 +9957,7 @@
           </w:tcPr>
           <w:p>
             <w:r>
-              <w:t xml:space="preserve">Row </w:t>
-            </w:r>
-            <w:r>
-              <w:t>2</w:t>
-            </w:r>
-            <w:r>
-              <w:t>, column 2 of any add user modal</w:t>
+              <w:t>Row 2, column 2 of any add user modal</w:t>
             </w:r>
           </w:p>
         </w:tc>
@@ -10000,16 +9967,10 @@
           </w:tcPr>
           <w:p>
             <w:r>
-              <w:t>Password</w:t>
-            </w:r>
-            <w:r>
-              <w:t xml:space="preserve"> text entry is sent to backend API on form submission</w:t>
-            </w:r>
-            <w:r>
-              <w:t xml:space="preserve"> </w:t>
-            </w:r>
-            <w:r>
-              <w:t>to be added to database.</w:t>
+              <w:t>Password text entry is sent to backend API on form submission</w:t>
+            </w:r>
+            <w:r>
+              <w:t xml:space="preserve"> to be added to database.</w:t>
             </w:r>
           </w:p>
         </w:tc>
@@ -10031,13 +9992,7 @@
           </w:tcPr>
           <w:p>
             <w:r>
-              <w:t xml:space="preserve">Row </w:t>
-            </w:r>
-            <w:r>
-              <w:t>3</w:t>
-            </w:r>
-            <w:r>
-              <w:t>, column 1 of</w:t>
+              <w:t>Row 3, column 1 of</w:t>
             </w:r>
             <w:r>
               <w:t xml:space="preserve"> </w:t>
@@ -10062,10 +10017,7 @@
               <w:t xml:space="preserve"> entry is sent to backend API on form submission</w:t>
             </w:r>
             <w:r>
-              <w:t xml:space="preserve"> </w:t>
-            </w:r>
-            <w:r>
-              <w:t>to be added to database.</w:t>
+              <w:t xml:space="preserve"> to be added to database.</w:t>
             </w:r>
           </w:p>
         </w:tc>
@@ -10131,13 +10083,7 @@
           </w:tcPr>
           <w:p>
             <w:r>
-              <w:t xml:space="preserve">Row </w:t>
-            </w:r>
-            <w:r>
-              <w:t>3</w:t>
-            </w:r>
-            <w:r>
-              <w:t>, column 2 of add GUEST user modal</w:t>
+              <w:t>Row 3, column 2 of add GUEST user modal</w:t>
             </w:r>
           </w:p>
         </w:tc>
@@ -10169,13 +10115,7 @@
           </w:tcPr>
           <w:p>
             <w:r>
-              <w:t xml:space="preserve">Row 3, column 2 of add </w:t>
-            </w:r>
-            <w:r>
-              <w:t>STAFF</w:t>
-            </w:r>
-            <w:r>
-              <w:t xml:space="preserve"> user modal</w:t>
+              <w:t>Row 3, column 2 of add STAFF user modal</w:t>
             </w:r>
           </w:p>
         </w:tc>
@@ -17806,10 +17746,7 @@
               <w:t xml:space="preserve"> </w:t>
             </w:r>
             <w:r>
-              <w:t xml:space="preserve"> </w:t>
-            </w:r>
-            <w:r>
-              <w:t>Not required as covered by lookup table</w:t>
+              <w:t xml:space="preserve"> Not required as covered by lookup table</w:t>
             </w:r>
           </w:p>
           <w:p>
@@ -17827,10 +17764,7 @@
               <w:t xml:space="preserve">Type Check: </w:t>
             </w:r>
             <w:r>
-              <w:t xml:space="preserve"> </w:t>
-            </w:r>
-            <w:r>
-              <w:t>Not required as covered by lookup table</w:t>
+              <w:t xml:space="preserve"> Not required as covered by lookup table</w:t>
             </w:r>
           </w:p>
           <w:p>
@@ -27631,6 +27565,7 @@
   <w:style w:type="character" w:default="1" w:styleId="DefaultParagraphFont">
     <w:name w:val="Default Paragraph Font"/>
     <w:uiPriority w:val="1"/>
+    <w:semiHidden/>
     <w:unhideWhenUsed/>
   </w:style>
   <w:style w:type="table" w:default="1" w:styleId="TableNormal">

</xml_diff>

<commit_message>
First designs of database
</commit_message>
<xml_diff>
--- a/.documentation/3 - Design.docx
+++ b/.documentation/3 - Design.docx
@@ -15232,6 +15232,65 @@
           </w:p>
         </w:tc>
       </w:tr>
+      <w:tr>
+        <w:tc>
+          <w:tcPr>
+            <w:tcW w:w="2569" w:type="dxa"/>
+          </w:tcPr>
+          <w:p>
+            <w:pPr>
+              <w:spacing w:after="160"/>
+            </w:pPr>
+            <w:r>
+              <w:t>favourite</w:t>
+            </w:r>
+          </w:p>
+        </w:tc>
+        <w:tc>
+          <w:tcPr>
+            <w:tcW w:w="1411" w:type="dxa"/>
+          </w:tcPr>
+          <w:p>
+            <w:pPr>
+              <w:spacing w:after="160"/>
+            </w:pPr>
+            <w:r>
+              <w:t>BOOLEAN</w:t>
+            </w:r>
+          </w:p>
+        </w:tc>
+        <w:tc>
+          <w:tcPr>
+            <w:tcW w:w="2573" w:type="dxa"/>
+          </w:tcPr>
+          <w:p>
+            <w:pPr>
+              <w:spacing w:after="160"/>
+            </w:pPr>
+            <w:r>
+              <w:t>True</w:t>
+            </w:r>
+          </w:p>
+          <w:p>
+            <w:pPr>
+              <w:spacing w:after="160"/>
+            </w:pPr>
+            <w:r>
+              <w:t>False</w:t>
+            </w:r>
+          </w:p>
+        </w:tc>
+        <w:tc>
+          <w:tcPr>
+            <w:tcW w:w="2463" w:type="dxa"/>
+          </w:tcPr>
+          <w:p>
+            <w:pPr>
+              <w:spacing w:after="160"/>
+            </w:pPr>
+          </w:p>
+        </w:tc>
+      </w:tr>
     </w:tbl>
     <w:p>
       <w:pPr>
@@ -15294,7 +15353,7 @@
         </w:tc>
         <w:tc>
           <w:tcPr>
-            <w:tcW w:w="1491" w:type="dxa"/>
+            <w:tcW w:w="1452" w:type="dxa"/>
             <w:shd w:val="clear" w:color="auto" w:fill="000000" w:themeFill="text1"/>
           </w:tcPr>
           <w:p>
@@ -15319,7 +15378,7 @@
         </w:tc>
         <w:tc>
           <w:tcPr>
-            <w:tcW w:w="2732" w:type="dxa"/>
+            <w:tcW w:w="2892" w:type="dxa"/>
             <w:shd w:val="clear" w:color="auto" w:fill="000000" w:themeFill="text1"/>
           </w:tcPr>
           <w:p>
@@ -15344,7 +15403,7 @@
         </w:tc>
         <w:tc>
           <w:tcPr>
-            <w:tcW w:w="2589" w:type="dxa"/>
+            <w:tcW w:w="2468" w:type="dxa"/>
             <w:shd w:val="clear" w:color="auto" w:fill="000000" w:themeFill="text1"/>
           </w:tcPr>
           <w:p>
@@ -15384,7 +15443,7 @@
         </w:tc>
         <w:tc>
           <w:tcPr>
-            <w:tcW w:w="1491" w:type="dxa"/>
+            <w:tcW w:w="1452" w:type="dxa"/>
           </w:tcPr>
           <w:p>
             <w:pPr>
@@ -15397,7 +15456,7 @@
         </w:tc>
         <w:tc>
           <w:tcPr>
-            <w:tcW w:w="2732" w:type="dxa"/>
+            <w:tcW w:w="2892" w:type="dxa"/>
           </w:tcPr>
           <w:p>
             <w:pPr>
@@ -15426,7 +15485,7 @@
         </w:tc>
         <w:tc>
           <w:tcPr>
-            <w:tcW w:w="2589" w:type="dxa"/>
+            <w:tcW w:w="2468" w:type="dxa"/>
           </w:tcPr>
           <w:p>
             <w:pPr>
@@ -15451,7 +15510,7 @@
         </w:tc>
         <w:tc>
           <w:tcPr>
-            <w:tcW w:w="1491" w:type="dxa"/>
+            <w:tcW w:w="1452" w:type="dxa"/>
           </w:tcPr>
           <w:p>
             <w:pPr>
@@ -15464,7 +15523,7 @@
         </w:tc>
         <w:tc>
           <w:tcPr>
-            <w:tcW w:w="2732" w:type="dxa"/>
+            <w:tcW w:w="2892" w:type="dxa"/>
           </w:tcPr>
           <w:p>
             <w:pPr>
@@ -15493,7 +15552,7 @@
         </w:tc>
         <w:tc>
           <w:tcPr>
-            <w:tcW w:w="2589" w:type="dxa"/>
+            <w:tcW w:w="2468" w:type="dxa"/>
           </w:tcPr>
           <w:p>
             <w:pPr>
@@ -15518,7 +15577,7 @@
         </w:tc>
         <w:tc>
           <w:tcPr>
-            <w:tcW w:w="1491" w:type="dxa"/>
+            <w:tcW w:w="1452" w:type="dxa"/>
           </w:tcPr>
           <w:p>
             <w:pPr>
@@ -15531,7 +15590,7 @@
         </w:tc>
         <w:tc>
           <w:tcPr>
-            <w:tcW w:w="2732" w:type="dxa"/>
+            <w:tcW w:w="2892" w:type="dxa"/>
           </w:tcPr>
           <w:p>
             <w:pPr>
@@ -15554,13 +15613,14 @@
               <w:spacing w:after="160"/>
             </w:pPr>
             <w:r>
+              <w:lastRenderedPageBreak/>
               <w:t>Jamie</w:t>
             </w:r>
           </w:p>
         </w:tc>
         <w:tc>
           <w:tcPr>
-            <w:tcW w:w="2589" w:type="dxa"/>
+            <w:tcW w:w="2468" w:type="dxa"/>
           </w:tcPr>
           <w:p>
             <w:pPr>
@@ -15585,7 +15645,7 @@
         </w:tc>
         <w:tc>
           <w:tcPr>
-            <w:tcW w:w="1491" w:type="dxa"/>
+            <w:tcW w:w="1452" w:type="dxa"/>
           </w:tcPr>
           <w:p>
             <w:pPr>
@@ -15598,7 +15658,7 @@
         </w:tc>
         <w:tc>
           <w:tcPr>
-            <w:tcW w:w="2732" w:type="dxa"/>
+            <w:tcW w:w="2892" w:type="dxa"/>
           </w:tcPr>
           <w:p>
             <w:pPr>
@@ -15613,7 +15673,6 @@
               <w:spacing w:after="160"/>
             </w:pPr>
             <w:r>
-              <w:lastRenderedPageBreak/>
               <w:t>Rameez</w:t>
             </w:r>
           </w:p>
@@ -15628,7 +15687,7 @@
         </w:tc>
         <w:tc>
           <w:tcPr>
-            <w:tcW w:w="2589" w:type="dxa"/>
+            <w:tcW w:w="2468" w:type="dxa"/>
           </w:tcPr>
           <w:p>
             <w:pPr>
@@ -15647,80 +15706,13 @@
               <w:spacing w:after="160"/>
             </w:pPr>
             <w:r>
-              <w:t>primary_companion_id</w:t>
-            </w:r>
-          </w:p>
-        </w:tc>
-        <w:tc>
-          <w:tcPr>
-            <w:tcW w:w="1491" w:type="dxa"/>
-          </w:tcPr>
-          <w:p>
-            <w:pPr>
-              <w:spacing w:after="160"/>
-            </w:pPr>
-            <w:r>
-              <w:t>INT</w:t>
-            </w:r>
-          </w:p>
-        </w:tc>
-        <w:tc>
-          <w:tcPr>
-            <w:tcW w:w="2732" w:type="dxa"/>
-          </w:tcPr>
-          <w:p>
-            <w:pPr>
-              <w:spacing w:after="160"/>
-            </w:pPr>
-            <w:r>
-              <w:t>1</w:t>
-            </w:r>
-          </w:p>
-          <w:p>
-            <w:pPr>
-              <w:spacing w:after="160"/>
-            </w:pPr>
-            <w:r>
-              <w:t>2</w:t>
-            </w:r>
-          </w:p>
-          <w:p>
-            <w:pPr>
-              <w:spacing w:after="160"/>
-            </w:pPr>
-            <w:r>
-              <w:t>3</w:t>
-            </w:r>
-          </w:p>
-        </w:tc>
-        <w:tc>
-          <w:tcPr>
-            <w:tcW w:w="2589" w:type="dxa"/>
-          </w:tcPr>
-          <w:p>
-            <w:pPr>
-              <w:spacing w:after="160"/>
-            </w:pPr>
-          </w:p>
-        </w:tc>
-      </w:tr>
-      <w:tr>
-        <w:tc>
-          <w:tcPr>
-            <w:tcW w:w="2204" w:type="dxa"/>
-          </w:tcPr>
-          <w:p>
-            <w:pPr>
-              <w:spacing w:after="160"/>
-            </w:pPr>
-            <w:r>
               <w:t>email</w:t>
             </w:r>
           </w:p>
         </w:tc>
         <w:tc>
           <w:tcPr>
-            <w:tcW w:w="1491" w:type="dxa"/>
+            <w:tcW w:w="1452" w:type="dxa"/>
           </w:tcPr>
           <w:p>
             <w:pPr>
@@ -15733,7 +15725,7 @@
         </w:tc>
         <w:tc>
           <w:tcPr>
-            <w:tcW w:w="2732" w:type="dxa"/>
+            <w:tcW w:w="2892" w:type="dxa"/>
           </w:tcPr>
           <w:p>
             <w:pPr>
@@ -15778,7 +15770,7 @@
         </w:tc>
         <w:tc>
           <w:tcPr>
-            <w:tcW w:w="2589" w:type="dxa"/>
+            <w:tcW w:w="2468" w:type="dxa"/>
           </w:tcPr>
           <w:p>
             <w:pPr>
@@ -15803,7 +15795,7 @@
         </w:tc>
         <w:tc>
           <w:tcPr>
-            <w:tcW w:w="1491" w:type="dxa"/>
+            <w:tcW w:w="1452" w:type="dxa"/>
           </w:tcPr>
           <w:p>
             <w:pPr>
@@ -15816,7 +15808,7 @@
         </w:tc>
         <w:tc>
           <w:tcPr>
-            <w:tcW w:w="2732" w:type="dxa"/>
+            <w:tcW w:w="2892" w:type="dxa"/>
           </w:tcPr>
           <w:p>
             <w:pPr>
@@ -15845,7 +15837,7 @@
         </w:tc>
         <w:tc>
           <w:tcPr>
-            <w:tcW w:w="2589" w:type="dxa"/>
+            <w:tcW w:w="2468" w:type="dxa"/>
           </w:tcPr>
           <w:p>
             <w:pPr>
@@ -15870,7 +15862,7 @@
         </w:tc>
         <w:tc>
           <w:tcPr>
-            <w:tcW w:w="1491" w:type="dxa"/>
+            <w:tcW w:w="1452" w:type="dxa"/>
           </w:tcPr>
           <w:p>
             <w:pPr>
@@ -15883,7 +15875,7 @@
         </w:tc>
         <w:tc>
           <w:tcPr>
-            <w:tcW w:w="2732" w:type="dxa"/>
+            <w:tcW w:w="2892" w:type="dxa"/>
           </w:tcPr>
           <w:p>
             <w:pPr>
@@ -15918,7 +15910,7 @@
         </w:tc>
         <w:tc>
           <w:tcPr>
-            <w:tcW w:w="2589" w:type="dxa"/>
+            <w:tcW w:w="2468" w:type="dxa"/>
           </w:tcPr>
           <w:p>
             <w:pPr>
@@ -16463,7 +16455,6 @@
               <w:spacing w:after="160"/>
             </w:pPr>
             <w:r>
-              <w:lastRenderedPageBreak/>
               <w:t>QERTy890_</w:t>
             </w:r>
           </w:p>
@@ -16489,6 +16480,7 @@
               <w:spacing w:after="160"/>
             </w:pPr>
             <w:r>
+              <w:lastRenderedPageBreak/>
               <w:t>type</w:t>
             </w:r>
           </w:p>

</xml_diff>

<commit_message>
Added docstrings for flights
</commit_message>
<xml_diff>
--- a/.documentation/3 - Design.docx
+++ b/.documentation/3 - Design.docx
@@ -10772,9 +10772,11 @@
             <w:pPr>
               <w:spacing w:after="160"/>
             </w:pPr>
+            <w:proofErr w:type="spellStart"/>
             <w:r>
               <w:t>airport_staff_id</w:t>
             </w:r>
+            <w:proofErr w:type="spellEnd"/>
           </w:p>
         </w:tc>
         <w:tc>
@@ -10842,9 +10844,11 @@
             <w:pPr>
               <w:spacing w:after="160"/>
             </w:pPr>
+            <w:proofErr w:type="spellStart"/>
             <w:r>
               <w:t>first_name</w:t>
             </w:r>
+            <w:proofErr w:type="spellEnd"/>
           </w:p>
         </w:tc>
         <w:tc>
@@ -10909,9 +10913,11 @@
             <w:pPr>
               <w:spacing w:after="160"/>
             </w:pPr>
+            <w:proofErr w:type="spellStart"/>
             <w:r>
               <w:t>last_name</w:t>
             </w:r>
+            <w:proofErr w:type="spellEnd"/>
           </w:p>
         </w:tc>
         <w:tc>
@@ -11180,9 +11186,11 @@
             <w:pPr>
               <w:spacing w:after="160"/>
             </w:pPr>
+            <w:proofErr w:type="spellStart"/>
             <w:r>
               <w:t>assigned_airport_icao</w:t>
             </w:r>
+            <w:proofErr w:type="spellEnd"/>
           </w:p>
         </w:tc>
         <w:tc>
@@ -11393,9 +11401,11 @@
             <w:pPr>
               <w:spacing w:after="160"/>
             </w:pPr>
+            <w:proofErr w:type="spellStart"/>
             <w:r>
               <w:t>airport_icao</w:t>
             </w:r>
+            <w:proofErr w:type="spellEnd"/>
           </w:p>
         </w:tc>
         <w:tc>
@@ -11463,9 +11473,11 @@
             <w:pPr>
               <w:spacing w:after="160"/>
             </w:pPr>
+            <w:proofErr w:type="spellStart"/>
             <w:r>
               <w:t>airport_iata</w:t>
             </w:r>
+            <w:proofErr w:type="spellEnd"/>
           </w:p>
         </w:tc>
         <w:tc>
@@ -11871,9 +11883,11 @@
             <w:pPr>
               <w:spacing w:after="160"/>
             </w:pPr>
+            <w:proofErr w:type="spellStart"/>
             <w:r>
               <w:t>timezone</w:t>
             </w:r>
+            <w:proofErr w:type="spellEnd"/>
           </w:p>
         </w:tc>
         <w:tc>
@@ -11914,8 +11928,13 @@
               <w:spacing w:after="160"/>
             </w:pPr>
             <w:r>
-              <w:t>America/New_York</w:t>
-            </w:r>
+              <w:t>America/</w:t>
+            </w:r>
+            <w:proofErr w:type="spellStart"/>
+            <w:r>
+              <w:t>New_York</w:t>
+            </w:r>
+            <w:proofErr w:type="spellEnd"/>
           </w:p>
         </w:tc>
         <w:tc>
@@ -11926,8 +11945,13 @@
             <w:pPr>
               <w:spacing w:after="160"/>
             </w:pPr>
-            <w:r>
-              <w:t xml:space="preserve">Timezone location used with </w:t>
+            <w:proofErr w:type="spellStart"/>
+            <w:r>
+              <w:t>Timezone</w:t>
+            </w:r>
+            <w:proofErr w:type="spellEnd"/>
+            <w:r>
+              <w:t xml:space="preserve"> location used with </w:t>
             </w:r>
             <w:r>
               <w:t>python library to find offset from UTC.</w:t>
@@ -12080,9 +12104,11 @@
             <w:pPr>
               <w:spacing w:after="160"/>
             </w:pPr>
+            <w:proofErr w:type="spellStart"/>
             <w:r>
               <w:t>route_id</w:t>
             </w:r>
+            <w:proofErr w:type="spellEnd"/>
           </w:p>
         </w:tc>
         <w:tc>
@@ -12152,9 +12178,11 @@
             <w:pPr>
               <w:spacing w:after="160"/>
             </w:pPr>
+            <w:proofErr w:type="spellStart"/>
             <w:r>
               <w:t>origin_icao</w:t>
             </w:r>
+            <w:proofErr w:type="spellEnd"/>
           </w:p>
         </w:tc>
         <w:tc>
@@ -12219,9 +12247,11 @@
             <w:pPr>
               <w:spacing w:after="160"/>
             </w:pPr>
+            <w:proofErr w:type="spellStart"/>
             <w:r>
               <w:t>destination_icao</w:t>
             </w:r>
+            <w:proofErr w:type="spellEnd"/>
           </w:p>
         </w:tc>
         <w:tc>
@@ -12263,6 +12293,75 @@
             </w:pPr>
             <w:r>
               <w:t>KJFK</w:t>
+            </w:r>
+          </w:p>
+        </w:tc>
+        <w:tc>
+          <w:tcPr>
+            <w:tcW w:w="2619" w:type="dxa"/>
+          </w:tcPr>
+          <w:p>
+            <w:pPr>
+              <w:spacing w:after="160"/>
+            </w:pPr>
+          </w:p>
+        </w:tc>
+      </w:tr>
+      <w:tr>
+        <w:tc>
+          <w:tcPr>
+            <w:tcW w:w="2118" w:type="dxa"/>
+          </w:tcPr>
+          <w:p>
+            <w:pPr>
+              <w:spacing w:after="160"/>
+            </w:pPr>
+            <w:proofErr w:type="spellStart"/>
+            <w:r>
+              <w:t>seat_price</w:t>
+            </w:r>
+            <w:proofErr w:type="spellEnd"/>
+          </w:p>
+        </w:tc>
+        <w:tc>
+          <w:tcPr>
+            <w:tcW w:w="1510" w:type="dxa"/>
+          </w:tcPr>
+          <w:p>
+            <w:pPr>
+              <w:spacing w:after="160"/>
+            </w:pPr>
+            <w:r>
+              <w:t>DECIMAL</w:t>
+            </w:r>
+          </w:p>
+        </w:tc>
+        <w:tc>
+          <w:tcPr>
+            <w:tcW w:w="2769" w:type="dxa"/>
+          </w:tcPr>
+          <w:p>
+            <w:pPr>
+              <w:spacing w:after="160"/>
+            </w:pPr>
+            <w:r>
+              <w:t>12,500.00</w:t>
+            </w:r>
+          </w:p>
+          <w:p>
+            <w:pPr>
+              <w:spacing w:after="160"/>
+            </w:pPr>
+            <w:r>
+              <w:t>3,500.99</w:t>
+            </w:r>
+          </w:p>
+          <w:p>
+            <w:pPr>
+              <w:spacing w:after="160"/>
+            </w:pPr>
+            <w:r>
+              <w:t>40,700.00</w:t>
             </w:r>
           </w:p>
         </w:tc>
@@ -12428,6 +12527,7 @@
                 <w:color w:val="000000" w:themeColor="text1"/>
               </w:rPr>
             </w:pPr>
+            <w:proofErr w:type="spellStart"/>
             <w:r>
               <w:rPr>
                 <w:color w:val="000000" w:themeColor="text1"/>
@@ -12440,6 +12540,7 @@
               </w:rPr>
               <w:t>ervice_id</w:t>
             </w:r>
+            <w:proofErr w:type="spellEnd"/>
           </w:p>
         </w:tc>
         <w:tc>
@@ -12531,9 +12632,11 @@
             <w:pPr>
               <w:spacing w:after="160"/>
             </w:pPr>
+            <w:proofErr w:type="spellStart"/>
             <w:r>
               <w:t>route_id</w:t>
             </w:r>
+            <w:proofErr w:type="spellEnd"/>
           </w:p>
         </w:tc>
         <w:tc>
@@ -12598,9 +12701,11 @@
             <w:pPr>
               <w:spacing w:after="160"/>
             </w:pPr>
+            <w:proofErr w:type="spellStart"/>
             <w:r>
               <w:t>start_date</w:t>
             </w:r>
+            <w:proofErr w:type="spellEnd"/>
           </w:p>
         </w:tc>
         <w:tc>
@@ -12665,9 +12770,11 @@
             <w:pPr>
               <w:spacing w:after="160"/>
             </w:pPr>
+            <w:proofErr w:type="spellStart"/>
             <w:r>
               <w:t>end_date</w:t>
             </w:r>
+            <w:proofErr w:type="spellEnd"/>
           </w:p>
         </w:tc>
         <w:tc>
@@ -12805,9 +12912,11 @@
             <w:pPr>
               <w:spacing w:after="160"/>
             </w:pPr>
+            <w:proofErr w:type="spellStart"/>
             <w:r>
               <w:t>repeats_on</w:t>
             </w:r>
+            <w:proofErr w:type="spellEnd"/>
           </w:p>
         </w:tc>
         <w:tc>
@@ -12881,6 +12990,7 @@
             <w:pPr>
               <w:spacing w:after="160"/>
             </w:pPr>
+            <w:proofErr w:type="spellStart"/>
             <w:r>
               <w:t>t</w:t>
             </w:r>
@@ -12890,6 +13000,7 @@
             <w:r>
               <w:t>_utc</w:t>
             </w:r>
+            <w:proofErr w:type="spellEnd"/>
           </w:p>
         </w:tc>
         <w:tc>
@@ -12955,6 +13066,7 @@
               <w:spacing w:after="160"/>
             </w:pPr>
             <w:r>
+              <w:lastRenderedPageBreak/>
               <w:t>frequency</w:t>
             </w:r>
           </w:p>
@@ -13021,10 +13133,11 @@
             <w:pPr>
               <w:spacing w:after="160"/>
             </w:pPr>
-            <w:r>
-              <w:lastRenderedPageBreak/>
+            <w:proofErr w:type="spellStart"/>
+            <w:r>
               <w:t>show_in_list</w:t>
             </w:r>
+            <w:proofErr w:type="spellEnd"/>
           </w:p>
         </w:tc>
         <w:tc>
@@ -13223,9 +13336,11 @@
             <w:pPr>
               <w:spacing w:after="160"/>
             </w:pPr>
+            <w:proofErr w:type="spellStart"/>
             <w:r>
               <w:t>flight_id</w:t>
             </w:r>
+            <w:proofErr w:type="spellEnd"/>
           </w:p>
         </w:tc>
         <w:tc>
@@ -13290,9 +13405,11 @@
             <w:pPr>
               <w:spacing w:after="160"/>
             </w:pPr>
+            <w:proofErr w:type="spellStart"/>
             <w:r>
               <w:t>flight_number</w:t>
             </w:r>
+            <w:proofErr w:type="spellEnd"/>
           </w:p>
         </w:tc>
         <w:tc>
@@ -13357,12 +13474,14 @@
             <w:pPr>
               <w:spacing w:after="160"/>
             </w:pPr>
+            <w:proofErr w:type="spellStart"/>
             <w:r>
               <w:t>s</w:t>
             </w:r>
             <w:r>
               <w:t>ervice_id</w:t>
             </w:r>
+            <w:proofErr w:type="spellEnd"/>
           </w:p>
         </w:tc>
         <w:tc>
@@ -13427,6 +13546,7 @@
             <w:pPr>
               <w:spacing w:after="160"/>
             </w:pPr>
+            <w:proofErr w:type="spellStart"/>
             <w:r>
               <w:t>scheduled_</w:t>
             </w:r>
@@ -13439,6 +13559,7 @@
             <w:r>
               <w:t>time_utc</w:t>
             </w:r>
+            <w:proofErr w:type="spellEnd"/>
           </w:p>
         </w:tc>
         <w:tc>
@@ -13503,9 +13624,11 @@
             <w:pPr>
               <w:spacing w:after="160"/>
             </w:pPr>
+            <w:proofErr w:type="spellStart"/>
             <w:r>
               <w:t>datetime_created</w:t>
             </w:r>
+            <w:proofErr w:type="spellEnd"/>
           </w:p>
         </w:tc>
         <w:tc>
@@ -13779,9 +13902,12 @@
             <w:pPr>
               <w:spacing w:after="160"/>
             </w:pPr>
-            <w:r>
+            <w:proofErr w:type="spellStart"/>
+            <w:r>
+              <w:lastRenderedPageBreak/>
               <w:t>booking_id</w:t>
             </w:r>
+            <w:proofErr w:type="spellEnd"/>
           </w:p>
         </w:tc>
         <w:tc>
@@ -13846,10 +13972,11 @@
             <w:pPr>
               <w:spacing w:after="160"/>
             </w:pPr>
-            <w:r>
-              <w:lastRenderedPageBreak/>
+            <w:proofErr w:type="spellStart"/>
+            <w:r>
               <w:t>guest_id</w:t>
             </w:r>
+            <w:proofErr w:type="spellEnd"/>
           </w:p>
         </w:tc>
         <w:tc>
@@ -13914,9 +14041,11 @@
             <w:pPr>
               <w:spacing w:after="160"/>
             </w:pPr>
+            <w:proofErr w:type="spellStart"/>
             <w:r>
               <w:t>flight_id</w:t>
             </w:r>
+            <w:proofErr w:type="spellEnd"/>
           </w:p>
         </w:tc>
         <w:tc>
@@ -13981,9 +14110,11 @@
             <w:pPr>
               <w:spacing w:after="160"/>
             </w:pPr>
+            <w:proofErr w:type="spellStart"/>
             <w:r>
               <w:t>datetime_booked_utc</w:t>
             </w:r>
+            <w:proofErr w:type="spellEnd"/>
           </w:p>
         </w:tc>
         <w:tc>
@@ -14048,9 +14179,11 @@
             <w:pPr>
               <w:spacing w:after="160"/>
             </w:pPr>
+            <w:proofErr w:type="spellStart"/>
             <w:r>
               <w:t>payment_cleared</w:t>
             </w:r>
+            <w:proofErr w:type="spellEnd"/>
           </w:p>
         </w:tc>
         <w:tc>
@@ -14243,9 +14376,11 @@
             <w:pPr>
               <w:spacing w:after="160"/>
             </w:pPr>
+            <w:proofErr w:type="spellStart"/>
             <w:r>
               <w:t>booking_id</w:t>
             </w:r>
+            <w:proofErr w:type="spellEnd"/>
           </w:p>
         </w:tc>
         <w:tc>
@@ -14310,9 +14445,11 @@
             <w:pPr>
               <w:spacing w:after="160"/>
             </w:pPr>
+            <w:proofErr w:type="spellStart"/>
             <w:r>
               <w:t>companion_id</w:t>
             </w:r>
+            <w:proofErr w:type="spellEnd"/>
           </w:p>
         </w:tc>
         <w:tc>
@@ -14377,9 +14514,11 @@
             <w:pPr>
               <w:spacing w:after="160"/>
             </w:pPr>
+            <w:proofErr w:type="spellStart"/>
             <w:r>
               <w:t>seat_id</w:t>
             </w:r>
+            <w:proofErr w:type="spellEnd"/>
           </w:p>
         </w:tc>
         <w:tc>
@@ -14580,9 +14719,11 @@
             <w:pPr>
               <w:spacing w:after="160"/>
             </w:pPr>
+            <w:proofErr w:type="spellStart"/>
             <w:r>
               <w:t>companion_id</w:t>
             </w:r>
+            <w:proofErr w:type="spellEnd"/>
           </w:p>
         </w:tc>
         <w:tc>
@@ -14647,9 +14788,11 @@
             <w:pPr>
               <w:spacing w:after="160"/>
             </w:pPr>
+            <w:proofErr w:type="spellStart"/>
             <w:r>
               <w:t>guest_id</w:t>
             </w:r>
+            <w:proofErr w:type="spellEnd"/>
           </w:p>
         </w:tc>
         <w:tc>
@@ -14690,6 +14833,7 @@
               <w:spacing w:after="160"/>
             </w:pPr>
             <w:r>
+              <w:lastRenderedPageBreak/>
               <w:t>3</w:t>
             </w:r>
           </w:p>
@@ -14714,9 +14858,11 @@
             <w:pPr>
               <w:spacing w:after="160"/>
             </w:pPr>
+            <w:proofErr w:type="spellStart"/>
             <w:r>
               <w:t>passport_name</w:t>
             </w:r>
+            <w:proofErr w:type="spellEnd"/>
           </w:p>
         </w:tc>
         <w:tc>
@@ -14749,7 +14895,6 @@
               <w:spacing w:after="160"/>
             </w:pPr>
             <w:r>
-              <w:lastRenderedPageBreak/>
               <w:t>Akil Rameez</w:t>
             </w:r>
           </w:p>
@@ -14782,9 +14927,11 @@
             <w:pPr>
               <w:spacing w:after="160"/>
             </w:pPr>
+            <w:proofErr w:type="spellStart"/>
             <w:r>
               <w:t>passport_number</w:t>
             </w:r>
+            <w:proofErr w:type="spellEnd"/>
           </w:p>
         </w:tc>
         <w:tc>
@@ -14849,9 +14996,11 @@
             <w:pPr>
               <w:spacing w:after="160"/>
             </w:pPr>
+            <w:proofErr w:type="spellStart"/>
             <w:r>
               <w:t>passport_expiry</w:t>
             </w:r>
+            <w:proofErr w:type="spellEnd"/>
           </w:p>
         </w:tc>
         <w:tc>
@@ -14983,9 +15132,11 @@
             <w:pPr>
               <w:spacing w:after="160"/>
             </w:pPr>
+            <w:proofErr w:type="spellStart"/>
             <w:r>
               <w:t>passport_issue_authority</w:t>
             </w:r>
+            <w:proofErr w:type="spellEnd"/>
           </w:p>
         </w:tc>
         <w:tc>
@@ -15050,9 +15201,11 @@
             <w:pPr>
               <w:spacing w:after="160"/>
             </w:pPr>
+            <w:proofErr w:type="spellStart"/>
             <w:r>
               <w:t>date_of_birth</w:t>
             </w:r>
+            <w:proofErr w:type="spellEnd"/>
           </w:p>
         </w:tc>
         <w:tc>
@@ -15436,9 +15589,11 @@
             <w:pPr>
               <w:spacing w:after="160"/>
             </w:pPr>
+            <w:proofErr w:type="spellStart"/>
             <w:r>
               <w:t>guest_id</w:t>
             </w:r>
+            <w:proofErr w:type="spellEnd"/>
           </w:p>
         </w:tc>
         <w:tc>
@@ -15503,9 +15658,11 @@
             <w:pPr>
               <w:spacing w:after="160"/>
             </w:pPr>
+            <w:proofErr w:type="spellStart"/>
             <w:r>
               <w:t>airline_employee_id</w:t>
             </w:r>
+            <w:proofErr w:type="spellEnd"/>
           </w:p>
         </w:tc>
         <w:tc>
@@ -15546,6 +15703,7 @@
               <w:spacing w:after="160"/>
             </w:pPr>
             <w:r>
+              <w:lastRenderedPageBreak/>
               <w:t>3</w:t>
             </w:r>
           </w:p>
@@ -15570,9 +15728,11 @@
             <w:pPr>
               <w:spacing w:after="160"/>
             </w:pPr>
+            <w:proofErr w:type="spellStart"/>
             <w:r>
               <w:t>first_name</w:t>
             </w:r>
+            <w:proofErr w:type="spellEnd"/>
           </w:p>
         </w:tc>
         <w:tc>
@@ -15613,7 +15773,6 @@
               <w:spacing w:after="160"/>
             </w:pPr>
             <w:r>
-              <w:lastRenderedPageBreak/>
               <w:t>Jamie</w:t>
             </w:r>
           </w:p>
@@ -15638,9 +15797,11 @@
             <w:pPr>
               <w:spacing w:after="160"/>
             </w:pPr>
+            <w:proofErr w:type="spellStart"/>
             <w:r>
               <w:t>last_name</w:t>
             </w:r>
+            <w:proofErr w:type="spellEnd"/>
           </w:p>
         </w:tc>
         <w:tc>
@@ -15788,9 +15949,11 @@
             <w:pPr>
               <w:spacing w:after="160"/>
             </w:pPr>
+            <w:proofErr w:type="spellStart"/>
             <w:r>
               <w:t>phone_number</w:t>
             </w:r>
+            <w:proofErr w:type="spellEnd"/>
           </w:p>
         </w:tc>
         <w:tc>
@@ -16064,9 +16227,11 @@
             <w:pPr>
               <w:spacing w:after="160"/>
             </w:pPr>
+            <w:proofErr w:type="spellStart"/>
             <w:r>
               <w:t>airline_employee_id</w:t>
             </w:r>
+            <w:proofErr w:type="spellEnd"/>
           </w:p>
         </w:tc>
         <w:tc>
@@ -16131,9 +16296,11 @@
             <w:pPr>
               <w:spacing w:after="160"/>
             </w:pPr>
+            <w:proofErr w:type="spellStart"/>
             <w:r>
               <w:t>first_name</w:t>
             </w:r>
+            <w:proofErr w:type="spellEnd"/>
           </w:p>
         </w:tc>
         <w:tc>
@@ -16198,9 +16365,11 @@
             <w:pPr>
               <w:spacing w:after="160"/>
             </w:pPr>
+            <w:proofErr w:type="spellStart"/>
             <w:r>
               <w:t>last_name</w:t>
             </w:r>
+            <w:proofErr w:type="spellEnd"/>
           </w:p>
         </w:tc>
         <w:tc>
@@ -16413,6 +16582,7 @@
               <w:spacing w:after="160"/>
             </w:pPr>
             <w:r>
+              <w:lastRenderedPageBreak/>
               <w:t>password</w:t>
             </w:r>
           </w:p>
@@ -16479,8 +16649,8 @@
             <w:pPr>
               <w:spacing w:after="160"/>
             </w:pPr>
-            <w:r>
-              <w:lastRenderedPageBreak/>
+            <w:proofErr w:type="spellStart"/>
+            <w:r>
               <w:t>e</w:t>
             </w:r>
             <w:r>
@@ -16489,6 +16659,7 @@
             <w:r>
               <w:t>type</w:t>
             </w:r>
+            <w:proofErr w:type="spellEnd"/>
           </w:p>
         </w:tc>
         <w:tc>

</xml_diff>

<commit_message>
Wrote first test for create_route
</commit_message>
<xml_diff>
--- a/.documentation/3 - Design.docx
+++ b/.documentation/3 - Design.docx
@@ -12687,6 +12687,7 @@
               <w:pStyle w:val="Heading5"/>
             </w:pPr>
             <w:r>
+              <w:lastRenderedPageBreak/>
               <w:t>Assigned Airport:</w:t>
             </w:r>
           </w:p>
@@ -16487,6 +16488,7 @@
               <w:spacing w:after="160"/>
             </w:pPr>
             <w:r>
+              <w:lastRenderedPageBreak/>
               <w:t>password</w:t>
             </w:r>
           </w:p>
@@ -25012,10 +25014,19 @@
         <w:t xml:space="preserve">Batch generate scheduled flights </w:t>
       </w:r>
       <w:r>
-        <w:t xml:space="preserve">is one of the functions </w:t>
-      </w:r>
-      <w:r>
-        <w:t>listed in my modules outlines.</w:t>
+        <w:t xml:space="preserve">generates flight records for </w:t>
+      </w:r>
+      <w:r>
+        <w:t xml:space="preserve">services. It is designed to be scheduled to run at a consistent time each day and will generate flights </w:t>
+      </w:r>
+      <w:r>
+        <w:t xml:space="preserve">x numbers of day in the future (skipping any that have already been generated) The x number of days in the future is a constant that I may tweak in development </w:t>
+      </w:r>
+      <w:r>
+        <w:t>but is shown in the pseudocode as 90 days.</w:t>
+      </w:r>
+      <w:r>
+        <w:t>.</w:t>
       </w:r>
       <w:r>
         <w:t xml:space="preserve"> The difficulty arises in distinguishing </w:t>
@@ -25102,7 +25113,21 @@
         <w:ind w:left="720"/>
       </w:pPr>
       <w:r>
-        <w:t>DECLARE previous_generation, next_generation = DATE</w:t>
+        <w:t xml:space="preserve">DECLARE </w:t>
+      </w:r>
+      <w:r>
+        <w:t>last</w:t>
+      </w:r>
+      <w:r>
+        <w:t>_generation, next_generation = DATE</w:t>
+      </w:r>
+    </w:p>
+    <w:p>
+      <w:pPr>
+        <w:ind w:left="720"/>
+      </w:pPr>
+      <w:r>
+        <w:t>DECARE today = DATE</w:t>
       </w:r>
     </w:p>
     <w:p>
@@ -25122,12 +25147,27 @@
         <w:t xml:space="preserve"> DAYS</w:t>
       </w:r>
     </w:p>
-    <w:p/>
     <w:p>
       <w:pPr>
         <w:ind w:left="720"/>
       </w:pPr>
       <w:r>
+        <w:t>SET today = DATE TODAY</w:t>
+      </w:r>
+    </w:p>
+    <w:p>
+      <w:pPr>
+        <w:rPr>
+          <w:sz w:val="2"/>
+          <w:szCs w:val="2"/>
+        </w:rPr>
+      </w:pPr>
+    </w:p>
+    <w:p>
+      <w:pPr>
+        <w:ind w:left="720"/>
+      </w:pPr>
+      <w:r>
         <w:t xml:space="preserve">SET active_schedules = SQL (SELECT * FROM </w:t>
       </w:r>
       <w:r>
@@ -25148,6 +25188,7 @@
         <w:ind w:left="720"/>
       </w:pPr>
       <w:r>
+        <w:lastRenderedPageBreak/>
         <w:t>SET total_schedules = LENGTH active_schedules – 1</w:t>
       </w:r>
     </w:p>
@@ -25191,9 +25232,404 @@
     <w:p>
       <w:pPr>
         <w:ind w:left="1440"/>
-      </w:pPr>
-      <w:r>
-        <w:t>SET next_generation = DATE 01/01/0000</w:t>
+        <w:rPr>
+          <w:sz w:val="2"/>
+          <w:szCs w:val="2"/>
+        </w:rPr>
+      </w:pPr>
+    </w:p>
+    <w:p>
+      <w:pPr>
+        <w:ind w:left="1440"/>
+      </w:pPr>
+      <w:r>
+        <w:t xml:space="preserve">SET last_generation = </w:t>
+      </w:r>
+      <w:r>
+        <w:t xml:space="preserve">FIRST </w:t>
+      </w:r>
+      <w:r>
+        <w:t>SQL (</w:t>
+      </w:r>
+      <w:r>
+        <w:t xml:space="preserve">SELECT </w:t>
+      </w:r>
+      <w:r>
+        <w:t>scheduled_departure_datetime_utc</w:t>
+      </w:r>
+      <w:r>
+        <w:t xml:space="preserve"> </w:t>
+      </w:r>
+      <w:r>
+        <w:t xml:space="preserve">FROM flights WHERE </w:t>
+      </w:r>
+      <w:r>
+        <w:t>service = schedule</w:t>
+      </w:r>
+      <w:r>
+        <w:t>[</w:t>
+      </w:r>
+      <w:r>
+        <w:t>service_id</w:t>
+      </w:r>
+      <w:r>
+        <w:t>]</w:t>
+      </w:r>
+      <w:r>
+        <w:t xml:space="preserve"> ORDER BY scheduled_departure_datetime_utc DESC)</w:t>
+      </w:r>
+    </w:p>
+    <w:p>
+      <w:pPr>
+        <w:rPr>
+          <w:sz w:val="2"/>
+          <w:szCs w:val="2"/>
+        </w:rPr>
+      </w:pPr>
+    </w:p>
+    <w:p>
+      <w:pPr>
+        <w:ind w:left="1440"/>
+      </w:pPr>
+      <w:r>
+        <w:t xml:space="preserve">WHILE </w:t>
+      </w:r>
+      <w:r>
+        <w:t xml:space="preserve">LOOP </w:t>
+      </w:r>
+      <w:r>
+        <w:t>last</w:t>
+      </w:r>
+      <w:r>
+        <w:t xml:space="preserve">_generation &lt; </w:t>
+      </w:r>
+      <w:r>
+        <w:t>today</w:t>
+      </w:r>
+      <w:r>
+        <w:t xml:space="preserve"> + batch_generate_lookahead</w:t>
+      </w:r>
+    </w:p>
+    <w:p>
+      <w:pPr>
+        <w:ind w:left="2160"/>
+      </w:pPr>
+      <w:r>
+        <w:t xml:space="preserve">IF </w:t>
+      </w:r>
+      <w:r>
+        <w:t xml:space="preserve">schedule[type] == </w:t>
+      </w:r>
+      <w:r>
+        <w:t>“</w:t>
+      </w:r>
+      <w:r>
+        <w:t>daily</w:t>
+      </w:r>
+      <w:r>
+        <w:t>”</w:t>
+      </w:r>
+    </w:p>
+    <w:p>
+      <w:pPr>
+        <w:ind w:left="2880"/>
+      </w:pPr>
+      <w:r>
+        <w:t>SET next_generation = last_generation +</w:t>
+      </w:r>
+      <w:r>
+        <w:t xml:space="preserve"> TIME DELTA (schedule[frequency]) DAYS</w:t>
+      </w:r>
+    </w:p>
+    <w:p>
+      <w:pPr>
+        <w:ind w:left="2160"/>
+      </w:pPr>
+      <w:r>
+        <w:t>ELIF schedule[type] ==</w:t>
+      </w:r>
+      <w:r>
+        <w:t>”</w:t>
+      </w:r>
+      <w:r>
+        <w:t xml:space="preserve"> weekly</w:t>
+      </w:r>
+      <w:r>
+        <w:t>”</w:t>
+      </w:r>
+    </w:p>
+    <w:p>
+      <w:pPr>
+        <w:ind w:left="2880"/>
+      </w:pPr>
+      <w:r>
+        <w:t>SET next_generation = last_generation + TIME DELTA (7 * schedule[frequency]) DAYS</w:t>
+      </w:r>
+    </w:p>
+    <w:p>
+      <w:pPr>
+        <w:ind w:left="2160"/>
+      </w:pPr>
+      <w:r>
+        <w:t xml:space="preserve">ELIF schedule[type] == </w:t>
+      </w:r>
+      <w:r>
+        <w:t>“</w:t>
+      </w:r>
+      <w:r>
+        <w:t>monthly</w:t>
+      </w:r>
+      <w:r>
+        <w:t>”</w:t>
+      </w:r>
+    </w:p>
+    <w:p>
+      <w:pPr>
+        <w:ind w:left="2880"/>
+      </w:pPr>
+      <w:r>
+        <w:t>SET next_generation = last_generation + TIME DELTA (schedule[frequency]) MONTHS</w:t>
+      </w:r>
+    </w:p>
+    <w:p>
+      <w:pPr>
+        <w:ind w:left="2160"/>
+      </w:pPr>
+      <w:r>
+        <w:t>END IF</w:t>
+      </w:r>
+    </w:p>
+    <w:p>
+      <w:pPr>
+        <w:ind w:left="2160"/>
+        <w:rPr>
+          <w:sz w:val="2"/>
+          <w:szCs w:val="2"/>
+        </w:rPr>
+      </w:pPr>
+    </w:p>
+    <w:p>
+      <w:pPr>
+        <w:ind w:left="2160"/>
+      </w:pPr>
+      <w:r>
+        <w:t>IF next_generation</w:t>
+      </w:r>
+      <w:r>
+        <w:t xml:space="preserve"> &lt;= today + batch_generate_lookahead</w:t>
+      </w:r>
+    </w:p>
+    <w:p>
+      <w:pPr>
+        <w:ind w:left="2160"/>
+      </w:pPr>
+      <w:r>
+        <w:tab/>
+        <w:t>SQL (INSERT INTO flights (</w:t>
+      </w:r>
+      <w:r>
+        <w:t xml:space="preserve">schedule[service_id], </w:t>
+      </w:r>
+      <w:r>
+        <w:t>next_generation)</w:t>
+      </w:r>
+      <w:r>
+        <w:t>)</w:t>
+      </w:r>
+    </w:p>
+    <w:p>
+      <w:pPr>
+        <w:ind w:left="2160"/>
+      </w:pPr>
+      <w:r>
+        <w:tab/>
+        <w:t>SET last_generation = next_generation</w:t>
+      </w:r>
+    </w:p>
+    <w:p>
+      <w:pPr>
+        <w:ind w:left="2160"/>
+      </w:pPr>
+      <w:r>
+        <w:t>END IF</w:t>
+      </w:r>
+    </w:p>
+    <w:p>
+      <w:pPr>
+        <w:ind w:left="1440"/>
+      </w:pPr>
+      <w:r>
+        <w:t>END WHILE LOOP</w:t>
+      </w:r>
+    </w:p>
+    <w:p>
+      <w:pPr>
+        <w:ind w:left="720"/>
+      </w:pPr>
+      <w:r>
+        <w:t>END FOR LOOP</w:t>
+      </w:r>
+    </w:p>
+    <w:p>
+      <w:r>
+        <w:t>END SUBROUTINE</w:t>
+      </w:r>
+    </w:p>
+    <w:p/>
+    <w:p/>
+    <w:p>
+      <w:pPr>
+        <w:pStyle w:val="Heading2"/>
+      </w:pPr>
+      <w:r>
+        <w:t>Batch Delete Abandoned Bookings</w:t>
+      </w:r>
+      <w:r>
+        <w:t>:</w:t>
+      </w:r>
+    </w:p>
+    <w:p>
+      <w:pPr>
+        <w:spacing w:after="160"/>
+      </w:pPr>
+      <w:r>
+        <w:t xml:space="preserve">Batch delete </w:t>
+      </w:r>
+      <w:r>
+        <w:t>is used to clear up any booking records that have not been purchased for long enough to indicate that they have been abandoned</w:t>
+      </w:r>
+      <w:r>
+        <w:t xml:space="preserve"> as well as any booking</w:t>
+      </w:r>
+      <w:r>
+        <w:t xml:space="preserve"> seat records associated with the abandoned booking.</w:t>
+      </w:r>
+      <w:r>
+        <w:t xml:space="preserve"> A booking is thought of as abandoned if its data of booing is greater than 30 days ago and the paid status is false.</w:t>
+      </w:r>
+    </w:p>
+    <w:p>
+      <w:pPr>
+        <w:spacing w:after="160"/>
+      </w:pPr>
+    </w:p>
+    <w:p>
+      <w:pPr>
+        <w:pStyle w:val="Heading4"/>
+      </w:pPr>
+      <w:r>
+        <w:t>Pseudocode:</w:t>
+      </w:r>
+    </w:p>
+    <w:p>
+      <w:r>
+        <w:t>For the sake of this pseudoc</w:t>
+      </w:r>
+      <w:r>
+        <w:t>ode, BOOKING is an OOP object containing all of the information associated with a booking. BOOKINGSEAT is an OOP object contain the information associated with a seat booking for a booking.</w:t>
+      </w:r>
+      <w:r>
+        <w:t xml:space="preserve"> It also assumes the existence of a date management library.</w:t>
+      </w:r>
+    </w:p>
+    <w:p/>
+    <w:p>
+      <w:r>
+        <w:t>DECLARE SUBROUTINE batch_delete_abandoned_bookings()</w:t>
+      </w:r>
+    </w:p>
+    <w:p>
+      <w:pPr>
+        <w:ind w:left="720"/>
+      </w:pPr>
+      <w:r>
+        <w:t>DECLARE booking = BOOK</w:t>
+      </w:r>
+      <w:r>
+        <w:t>ING</w:t>
+      </w:r>
+    </w:p>
+    <w:p>
+      <w:pPr>
+        <w:ind w:left="720"/>
+      </w:pPr>
+      <w:r>
+        <w:lastRenderedPageBreak/>
+        <w:t>DECLARE abandoned_bookings = ARRAY[</w:t>
+      </w:r>
+      <w:r>
+        <w:t>booking</w:t>
+      </w:r>
+      <w:r>
+        <w:t>]</w:t>
+      </w:r>
+    </w:p>
+    <w:p>
+      <w:pPr>
+        <w:ind w:left="720"/>
+      </w:pPr>
+      <w:r>
+        <w:t>DECLARE i = INT</w:t>
+      </w:r>
+    </w:p>
+    <w:p>
+      <w:pPr>
+        <w:ind w:left="720"/>
+        <w:rPr>
+          <w:sz w:val="2"/>
+          <w:szCs w:val="2"/>
+        </w:rPr>
+      </w:pPr>
+    </w:p>
+    <w:p>
+      <w:pPr>
+        <w:ind w:left="720"/>
+      </w:pPr>
+      <w:r>
+        <w:t xml:space="preserve">SET abandoned_bookings = SQL (SELECT * FROM </w:t>
+      </w:r>
+      <w:r>
+        <w:t xml:space="preserve">bookings WHERE datetime_booked &gt;= now </w:t>
+      </w:r>
+      <w:r>
+        <w:t>-</w:t>
+      </w:r>
+      <w:r>
+        <w:t xml:space="preserve"> 30 DAYS AND </w:t>
+      </w:r>
+      <w:r>
+        <w:t>payment_cleared = False)</w:t>
+      </w:r>
+    </w:p>
+    <w:p>
+      <w:pPr>
+        <w:ind w:left="720"/>
+        <w:rPr>
+          <w:sz w:val="2"/>
+          <w:szCs w:val="2"/>
+        </w:rPr>
+      </w:pPr>
+    </w:p>
+    <w:p>
+      <w:pPr>
+        <w:ind w:left="720"/>
+      </w:pPr>
+      <w:r>
+        <w:t xml:space="preserve">FOR LOOP (SET i=0) IN LENGTH abandoned_bookings </w:t>
+      </w:r>
+      <w:r>
+        <w:t>–</w:t>
+      </w:r>
+      <w:r>
+        <w:t xml:space="preserve"> 1</w:t>
+      </w:r>
+    </w:p>
+    <w:p>
+      <w:pPr>
+        <w:ind w:left="1440"/>
+      </w:pPr>
+      <w:r>
+        <w:t>SET booking = abandoned_bookings[i]</w:t>
       </w:r>
     </w:p>
     <w:p>
@@ -25210,56 +25646,143 @@
         <w:ind w:left="1440"/>
       </w:pPr>
       <w:r>
-        <w:t xml:space="preserve">SET last_generation = </w:t>
-      </w:r>
-      <w:r>
-        <w:t xml:space="preserve">FIRST </w:t>
-      </w:r>
-      <w:r>
         <w:t>SQL (</w:t>
       </w:r>
       <w:r>
-        <w:t xml:space="preserve">SELECT </w:t>
-      </w:r>
-      <w:r>
-        <w:t>scheduled_departure_datetime_utc</w:t>
-      </w:r>
-      <w:r>
-        <w:t xml:space="preserve"> </w:t>
-      </w:r>
-      <w:r>
-        <w:t xml:space="preserve">FROM flights WHERE </w:t>
-      </w:r>
-      <w:r>
-        <w:t>service = schedule.service_id ORDER BY scheduled_departure_datetime_utc DESC)</w:t>
-      </w:r>
-    </w:p>
-    <w:p>
-      <w:pPr>
-        <w:rPr>
-          <w:sz w:val="2"/>
-          <w:szCs w:val="2"/>
-        </w:rPr>
-      </w:pPr>
+        <w:t xml:space="preserve">DELETE FROM </w:t>
+      </w:r>
+      <w:r>
+        <w:t>bookings_seats WHERE booking_id = booking[booking_id])</w:t>
+      </w:r>
     </w:p>
     <w:p>
       <w:pPr>
         <w:ind w:left="1440"/>
       </w:pPr>
       <w:r>
-        <w:t xml:space="preserve">WHILE </w:t>
-      </w:r>
-      <w:r>
-        <w:t xml:space="preserve">LOOP </w:t>
-      </w:r>
-      <w:r>
-        <w:t xml:space="preserve">next_generation &lt; </w:t>
-      </w:r>
-      <w:r>
-        <w:t>today</w:t>
-      </w:r>
-      <w:r>
-        <w:t xml:space="preserve"> + batch_generate_lookahead</w:t>
+        <w:t>SQL (DELETE FROM bookings WHERE booking_id = booking[booking_id])</w:t>
+      </w:r>
+    </w:p>
+    <w:p>
+      <w:pPr>
+        <w:ind w:left="720"/>
+      </w:pPr>
+      <w:r>
+        <w:t>END FOR LOOP</w:t>
+      </w:r>
+    </w:p>
+    <w:p>
+      <w:r>
+        <w:t>END SUBROUTINE</w:t>
+      </w:r>
+    </w:p>
+    <w:p/>
+    <w:p>
+      <w:pPr>
+        <w:pStyle w:val="Heading2"/>
+      </w:pPr>
+      <w:r>
+        <w:t>Book Seat</w:t>
+      </w:r>
+      <w:r>
+        <w:t>:</w:t>
+      </w:r>
+    </w:p>
+    <w:p>
+      <w:r>
+        <w:t xml:space="preserve">The book seat algorithm creates a booking seat record for a given booking ID, companion ID, and seat ID. </w:t>
+      </w:r>
+      <w:r>
+        <w:t>Seat IDs have to be checked that they are valid and not already booked for the given flight.</w:t>
+      </w:r>
+    </w:p>
+    <w:p/>
+    <w:p>
+      <w:pPr>
+        <w:pStyle w:val="Heading4"/>
+      </w:pPr>
+      <w:r>
+        <w:t>Pseudocode:</w:t>
+      </w:r>
+    </w:p>
+    <w:p>
+      <w:r>
+        <w:t xml:space="preserve">For the sake of this pseudocode algorithm, AVAILABLE_SEATS is a constant array </w:t>
+      </w:r>
+      <w:r>
+        <w:t>with a list of all the available seat IDs</w:t>
+      </w:r>
+      <w:r>
+        <w:t xml:space="preserve"> irrespective of if they have already booked. This is used to check that the seat exists and isn’t something unreasonable like </w:t>
+      </w:r>
+      <w:r>
+        <w:t>500Z</w:t>
+      </w:r>
+      <w:r>
+        <w:t>.</w:t>
+      </w:r>
+    </w:p>
+    <w:p/>
+    <w:p>
+      <w:r>
+        <w:t>DECLARE SUBROUTINE book_seat(booking_id: INT, seat_id: INT, companion_id: INT)</w:t>
+      </w:r>
+    </w:p>
+    <w:p>
+      <w:pPr>
+        <w:ind w:left="720"/>
+      </w:pPr>
+      <w:r>
+        <w:t>DECL</w:t>
+      </w:r>
+      <w:r>
+        <w:t xml:space="preserve">ARE </w:t>
+      </w:r>
+    </w:p>
+    <w:p>
+      <w:pPr>
+        <w:ind w:left="720"/>
+      </w:pPr>
+    </w:p>
+    <w:p>
+      <w:pPr>
+        <w:ind w:left="720"/>
+      </w:pPr>
+      <w:r>
+        <w:t>SET found = False</w:t>
+      </w:r>
+    </w:p>
+    <w:p>
+      <w:pPr>
+        <w:ind w:left="720"/>
+      </w:pPr>
+    </w:p>
+    <w:p>
+      <w:pPr>
+        <w:ind w:left="720"/>
+      </w:pPr>
+      <w:r>
+        <w:t>FOR</w:t>
+      </w:r>
+      <w:r>
+        <w:t xml:space="preserve"> LOOP</w:t>
+      </w:r>
+      <w:r>
+        <w:t xml:space="preserve"> (SET i = 0) IN LENGTH </w:t>
+      </w:r>
+      <w:r>
+        <w:t>AVAILABLE_SEATS – 1:</w:t>
+      </w:r>
+    </w:p>
+    <w:p>
+      <w:pPr>
+        <w:ind w:left="1440"/>
+      </w:pPr>
+      <w:r>
+        <w:t>IF AVAILABLE_SEATS</w:t>
+      </w:r>
+      <w:r>
+        <w:t>[i] == seat_id:</w:t>
       </w:r>
     </w:p>
     <w:p>
@@ -25267,58 +25790,12 @@
         <w:ind w:left="2160"/>
       </w:pPr>
       <w:r>
-        <w:t xml:space="preserve">IF </w:t>
-      </w:r>
-      <w:r>
-        <w:t>schedule[type] == daily</w:t>
-      </w:r>
-    </w:p>
-    <w:p>
-      <w:pPr>
-        <w:ind w:left="2880"/>
-      </w:pPr>
-      <w:r>
-        <w:t>SET next_generation = last_generation +</w:t>
-      </w:r>
-      <w:r>
-        <w:t xml:space="preserve"> TIME DELTA (schedule[frequency]) DAYS</w:t>
-      </w:r>
-    </w:p>
-    <w:p>
-      <w:pPr>
-        <w:ind w:left="2160"/>
-      </w:pPr>
-      <w:r>
-        <w:t>ELIF schedule[type] == weekly</w:t>
-      </w:r>
-    </w:p>
-    <w:p>
-      <w:pPr>
-        <w:ind w:left="2880"/>
-      </w:pPr>
-      <w:r>
-        <w:t>SET next_generation = last_generation + TIME DELTA (7 * schedule[frequency]) DAYS</w:t>
-      </w:r>
-    </w:p>
-    <w:p>
-      <w:pPr>
-        <w:ind w:left="2160"/>
-      </w:pPr>
-      <w:r>
-        <w:t>ELIF schedule[type] == monthly</w:t>
-      </w:r>
-    </w:p>
-    <w:p>
-      <w:pPr>
-        <w:ind w:left="2880"/>
-      </w:pPr>
-      <w:r>
-        <w:t>SET next_generation = last_generation + TIME DELTA (schedule[frequency]) MONTHS</w:t>
-      </w:r>
-    </w:p>
-    <w:p>
-      <w:pPr>
-        <w:ind w:left="2160"/>
+        <w:t>SET found = True</w:t>
+      </w:r>
+    </w:p>
+    <w:p>
+      <w:pPr>
+        <w:ind w:left="1440"/>
       </w:pPr>
       <w:r>
         <w:t>END IF</w:t>
@@ -25326,51 +25803,44 @@
     </w:p>
     <w:p>
       <w:pPr>
-        <w:ind w:left="2160"/>
-        <w:rPr>
-          <w:sz w:val="2"/>
-          <w:szCs w:val="2"/>
-        </w:rPr>
-      </w:pPr>
-    </w:p>
-    <w:p>
-      <w:pPr>
-        <w:ind w:left="2160"/>
-      </w:pPr>
-      <w:r>
-        <w:t>IF next_generation</w:t>
-      </w:r>
-      <w:r>
-        <w:t xml:space="preserve"> &lt;= today + batch_generate_lookahead</w:t>
-      </w:r>
-    </w:p>
-    <w:p>
-      <w:pPr>
-        <w:ind w:left="2160"/>
-      </w:pPr>
-      <w:r>
-        <w:tab/>
-        <w:t>SQL (INSERT INTO flights (</w:t>
-      </w:r>
-      <w:r>
-        <w:t xml:space="preserve">schedule[service_id], </w:t>
-      </w:r>
-      <w:r>
-        <w:t>next_generation)</w:t>
-      </w:r>
-    </w:p>
-    <w:p>
-      <w:pPr>
-        <w:ind w:left="2160"/>
-      </w:pPr>
-      <w:r>
-        <w:tab/>
-        <w:t>SET last_generation = next_generation</w:t>
-      </w:r>
-    </w:p>
-    <w:p>
-      <w:pPr>
-        <w:ind w:left="2160"/>
+        <w:ind w:left="720"/>
+      </w:pPr>
+      <w:r>
+        <w:t>END FOR LOOP</w:t>
+      </w:r>
+    </w:p>
+    <w:p>
+      <w:pPr>
+        <w:ind w:left="720"/>
+      </w:pPr>
+    </w:p>
+    <w:p>
+      <w:pPr>
+        <w:ind w:left="720"/>
+      </w:pPr>
+      <w:r>
+        <w:t>IF found == False:</w:t>
+      </w:r>
+    </w:p>
+    <w:p>
+      <w:pPr>
+        <w:ind w:left="1440"/>
+      </w:pPr>
+      <w:r>
+        <w:t>OUTPUT (“Invalid SeatID”)</w:t>
+      </w:r>
+    </w:p>
+    <w:p>
+      <w:pPr>
+        <w:ind w:left="1440"/>
+      </w:pPr>
+      <w:r>
+        <w:t>RASIE EXCEPTION</w:t>
+      </w:r>
+    </w:p>
+    <w:p>
+      <w:pPr>
+        <w:ind w:left="720"/>
       </w:pPr>
       <w:r>
         <w:t>END IF</w:t>
@@ -25378,10 +25848,68 @@
     </w:p>
     <w:p>
       <w:pPr>
+        <w:ind w:left="720"/>
+      </w:pPr>
+    </w:p>
+    <w:p>
+      <w:pPr>
+        <w:ind w:left="720"/>
+      </w:pPr>
+      <w:r>
+        <w:t>SET flight_id = SQL (</w:t>
+      </w:r>
+      <w:r>
+        <w:t xml:space="preserve">SELECT flight_id FROM </w:t>
+      </w:r>
+      <w:r>
+        <w:t>bookings</w:t>
+      </w:r>
+      <w:r>
+        <w:t xml:space="preserve"> WHERE </w:t>
+      </w:r>
+      <w:r>
+        <w:t>booking_id = booking_id)</w:t>
+      </w:r>
+    </w:p>
+    <w:p>
+      <w:pPr>
+        <w:ind w:left="720"/>
+      </w:pPr>
+      <w:r>
+        <w:lastRenderedPageBreak/>
+        <w:t xml:space="preserve">SET already_booked = SQL (SELECT * FROM booking_seats WHERE flight_id = flight_id AND </w:t>
+      </w:r>
+      <w:r>
+        <w:t>seat_id = seat_id)</w:t>
+      </w:r>
+    </w:p>
+    <w:p>
+      <w:pPr>
+        <w:ind w:left="720"/>
+      </w:pPr>
+    </w:p>
+    <w:p>
+      <w:pPr>
+        <w:ind w:left="720"/>
+      </w:pPr>
+      <w:r>
+        <w:t>IF already_booked != None:</w:t>
+      </w:r>
+    </w:p>
+    <w:p>
+      <w:pPr>
         <w:ind w:left="1440"/>
       </w:pPr>
       <w:r>
-        <w:t>END WHILE LOOP</w:t>
+        <w:t>OUTPUT (“Seat is already booked”)</w:t>
+      </w:r>
+    </w:p>
+    <w:p>
+      <w:pPr>
+        <w:ind w:left="1440"/>
+      </w:pPr>
+      <w:r>
+        <w:t>RAISE EXCEPTION</w:t>
       </w:r>
     </w:p>
     <w:p>
@@ -25389,7 +25917,103 @@
         <w:ind w:left="720"/>
       </w:pPr>
       <w:r>
-        <w:t>END FOR LOOP</w:t>
+        <w:t>END IF</w:t>
+      </w:r>
+    </w:p>
+    <w:p>
+      <w:pPr>
+        <w:ind w:left="720"/>
+      </w:pPr>
+    </w:p>
+    <w:p>
+      <w:pPr>
+        <w:ind w:left="720"/>
+      </w:pPr>
+      <w:r>
+        <w:t xml:space="preserve">SET companion = SQL (SELECT * FROM companions WHERE companion_id = companion_id AND </w:t>
+      </w:r>
+      <w:r>
+        <w:t>guest_id = (SELECT guest_id FROM bookings WHERE booking_id = booking_id))</w:t>
+      </w:r>
+    </w:p>
+    <w:p>
+      <w:pPr>
+        <w:ind w:left="720"/>
+      </w:pPr>
+    </w:p>
+    <w:p>
+      <w:pPr>
+        <w:ind w:left="720"/>
+      </w:pPr>
+      <w:r>
+        <w:t>IF companion == None:</w:t>
+      </w:r>
+    </w:p>
+    <w:p>
+      <w:pPr>
+        <w:ind w:left="1440"/>
+      </w:pPr>
+      <w:r>
+        <w:t>OUTPUT (“Companion does not exist</w:t>
+      </w:r>
+      <w:r>
+        <w:t xml:space="preserve"> or is not attached to guest</w:t>
+      </w:r>
+      <w:r>
+        <w:t>”)</w:t>
+      </w:r>
+    </w:p>
+    <w:p>
+      <w:pPr>
+        <w:ind w:left="1440"/>
+      </w:pPr>
+      <w:r>
+        <w:t>RASIE EXCEPTION</w:t>
+      </w:r>
+    </w:p>
+    <w:p>
+      <w:pPr>
+        <w:ind w:left="720"/>
+      </w:pPr>
+      <w:r>
+        <w:t>END IF</w:t>
+      </w:r>
+    </w:p>
+    <w:p>
+      <w:pPr>
+        <w:ind w:left="720"/>
+      </w:pPr>
+    </w:p>
+    <w:p>
+      <w:pPr>
+        <w:ind w:left="720"/>
+      </w:pPr>
+      <w:r>
+        <w:t>SQL (INSERT INTO booking</w:t>
+      </w:r>
+      <w:r>
+        <w:t>_</w:t>
+      </w:r>
+      <w:r>
+        <w:t>s</w:t>
+      </w:r>
+      <w:r>
+        <w:t xml:space="preserve">eats </w:t>
+      </w:r>
+      <w:r>
+        <w:t xml:space="preserve">(booking_id, seat_id, companion_id) </w:t>
+      </w:r>
+      <w:r>
+        <w:t xml:space="preserve">VALUES ( booking_id, </w:t>
+      </w:r>
+      <w:r>
+        <w:t>s</w:t>
+      </w:r>
+      <w:r>
+        <w:t xml:space="preserve">eat_id, </w:t>
+      </w:r>
+      <w:r>
+        <w:t>companion_id)</w:t>
       </w:r>
     </w:p>
     <w:p>
@@ -25397,181 +26021,15 @@
         <w:t>END SUBROUTINE</w:t>
       </w:r>
     </w:p>
-    <w:p/>
-    <w:p/>
-    <w:p>
-      <w:pPr>
-        <w:pStyle w:val="Heading2"/>
-      </w:pPr>
-      <w:r>
-        <w:t>Batch Delete Abandoned Bookings</w:t>
-      </w:r>
-      <w:r>
-        <w:t>:</w:t>
-      </w:r>
-    </w:p>
-    <w:p>
-      <w:pPr>
-        <w:spacing w:after="160"/>
-      </w:pPr>
-      <w:r>
-        <w:t>Batch delete abandoned is another of the full functions that I listed in my algorithms</w:t>
-      </w:r>
-      <w:r>
-        <w:t xml:space="preserve"> previously. It is used to clear up any booking records that have not been purchased for long enough to indicate that they have been abandoned.</w:t>
-      </w:r>
-    </w:p>
-    <w:p>
-      <w:pPr>
-        <w:spacing w:after="160"/>
-      </w:pPr>
-    </w:p>
-    <w:p>
-      <w:pPr>
-        <w:pStyle w:val="Heading4"/>
-      </w:pPr>
-      <w:r>
-        <w:t>Pseudocode:</w:t>
-      </w:r>
-    </w:p>
-    <w:p>
-      <w:r>
-        <w:t>For the sake of this pseudoc</w:t>
-      </w:r>
-      <w:r>
-        <w:t>ode, BOOKING is an OOP object containing all of the information associated with a booking. BOOKINGSEAT is an OOP object contain the information associated with a seat booking for a booking.</w:t>
-      </w:r>
-      <w:r>
-        <w:t xml:space="preserve"> It also assumes the existence of a date management library.</w:t>
-      </w:r>
-    </w:p>
-    <w:p/>
-    <w:p>
-      <w:r>
-        <w:t>DECLARE SUBROUTINE batch_delete_abandoned_bookings()</w:t>
-      </w:r>
-    </w:p>
     <w:p>
       <w:pPr>
         <w:ind w:left="720"/>
       </w:pPr>
-      <w:r>
-        <w:t>DECLARE booking = BOOK</w:t>
-      </w:r>
-      <w:r>
-        <w:t>ING</w:t>
-      </w:r>
     </w:p>
     <w:p>
       <w:pPr>
         <w:ind w:left="720"/>
       </w:pPr>
-      <w:r>
-        <w:t>DECLARE abandoned_bookings = ARRAY[</w:t>
-      </w:r>
-      <w:r>
-        <w:t>booking</w:t>
-      </w:r>
-      <w:r>
-        <w:t>]</w:t>
-      </w:r>
-    </w:p>
-    <w:p>
-      <w:pPr>
-        <w:ind w:left="720"/>
-      </w:pPr>
-      <w:r>
-        <w:t>DECLARE i = INT</w:t>
-      </w:r>
-    </w:p>
-    <w:p>
-      <w:pPr>
-        <w:ind w:left="720"/>
-        <w:rPr>
-          <w:sz w:val="2"/>
-          <w:szCs w:val="2"/>
-        </w:rPr>
-      </w:pPr>
-    </w:p>
-    <w:p>
-      <w:pPr>
-        <w:ind w:left="720"/>
-      </w:pPr>
-      <w:r>
-        <w:t xml:space="preserve">SET abandoned_bookings = SQL (SELECT * FROM </w:t>
-      </w:r>
-      <w:r>
-        <w:t xml:space="preserve">bookings WHERE datetime_booked &gt;= now + 30 DAYS AND </w:t>
-      </w:r>
-      <w:r>
-        <w:t>payment_cleared = False)</w:t>
-      </w:r>
-    </w:p>
-    <w:p>
-      <w:pPr>
-        <w:ind w:left="720"/>
-        <w:rPr>
-          <w:sz w:val="2"/>
-          <w:szCs w:val="2"/>
-        </w:rPr>
-      </w:pPr>
-    </w:p>
-    <w:p>
-      <w:pPr>
-        <w:ind w:left="720"/>
-      </w:pPr>
-      <w:r>
-        <w:t xml:space="preserve">FOR LOOP (SET i=0) IN LENGTH abandoned_bookings </w:t>
-      </w:r>
-      <w:r>
-        <w:t>–</w:t>
-      </w:r>
-      <w:r>
-        <w:t xml:space="preserve"> 1</w:t>
-      </w:r>
-    </w:p>
-    <w:p>
-      <w:pPr>
-        <w:ind w:left="1440"/>
-      </w:pPr>
-      <w:r>
-        <w:t>SET booking = abandoned_bookings[i]</w:t>
-      </w:r>
-    </w:p>
-    <w:p>
-      <w:pPr>
-        <w:ind w:left="1440"/>
-      </w:pPr>
-      <w:r>
-        <w:t>SQL (</w:t>
-      </w:r>
-      <w:r>
-        <w:t xml:space="preserve">DELETE FROM </w:t>
-      </w:r>
-      <w:r>
-        <w:t>bookings_seats WHERE booking_id = booking[booking_id])</w:t>
-      </w:r>
-    </w:p>
-    <w:p>
-      <w:pPr>
-        <w:ind w:left="1440"/>
-      </w:pPr>
-      <w:r>
-        <w:t>SQL (DELETE FROM bookings WHERE booking_id = booking[booking_id])</w:t>
-      </w:r>
-    </w:p>
-    <w:p>
-      <w:pPr>
-        <w:ind w:left="720"/>
-      </w:pPr>
-      <w:r>
-        <w:t>END FOR LOOP</w:t>
-      </w:r>
-    </w:p>
-    <w:p>
-      <w:r>
-        <w:t>END SUBROUTINE</w:t>
-      </w:r>
     </w:p>
     <w:sectPr>
       <w:headerReference w:type="default" r:id="rId43"/>
@@ -31427,7 +31885,6 @@
   <w:style w:type="character" w:default="1" w:styleId="DefaultParagraphFont">
     <w:name w:val="Default Paragraph Font"/>
     <w:uiPriority w:val="1"/>
-    <w:semiHidden/>
     <w:unhideWhenUsed/>
   </w:style>
   <w:style w:type="table" w:default="1" w:styleId="TableNormal">

</xml_diff>